<commit_message>
Position paper: no more {{NUME_CETATEAN}}, and say the Senate form needs an account (issue #7)
- the intro written by the models kept a {{NUME_CETATEAN}} placeholder in 54 bills: the ready-made .docx now leaves a blank to fill in and signs with „Nume și prenume: …”; the personalized one skips that intro, since its own first paragraph already carries the name
- the Senate tab of the action kit says the online form needs an account on online.senat.ro, links the consultation service, and offers infopub@senat.ro without one
</commit_message>
<xml_diff>
--- a/public/docs/Punct_de_vedere_B523-2026.docx
+++ b/public/docs/Punct_de_vedere_B523-2026.docx
@@ -64,7 +64,7 @@
           <w:sz w:val="22"/>
           <w:szCs w:val="22"/>
         </w:rPr>
-        <w:t xml:space="preserve">Subsemnatul(a) {{NUME_CETATEAN}}, în temeiul procedurii de consultare publică a Senatului României, formulez prezentul Punct de vedere referitor la Propunerea legislativă B523/2026 (Propunere legislativă pentru declararea anului 2027 drept "Anul cultural Ion Voicu").</w:t>
+        <w:t xml:space="preserve">Subsemnatul(a) ……………………………………, în temeiul procedurii de consultare publică a Senatului României, formulez prezentul Punct de vedere referitor la Propunerea legislativă B523/2026 (Propunere legislativă pentru declararea anului 2027 drept "Anul cultural Ion Voicu").</w:t>
       </w:r>
     </w:p>
     <w:p>
@@ -266,7 +266,7 @@
           <w:sz w:val="22"/>
           <w:szCs w:val="22"/>
         </w:rPr>
-        <w:t xml:space="preserve">Cetățean / Contribuabil / Reprezentant al Societății Civile</w:t>
+        <w:t xml:space="preserve">Nume și prenume: ……………………………………</w:t>
       </w:r>
     </w:p>
     <w:p>

</xml_diff>

<commit_message>
Position paper: the AI models only in a note at the end
The document is the citizen's, signed by them: the heading no longer carries „Scor Risc AI — Gemini + Claude + ChatGPT”, the fallback section names each perspective by its subject instead of the model, and both versions end with „Pregătit cu destrajă.ro, pe baza analizei a trei modele AI”.
</commit_message>
<xml_diff>
--- a/public/docs/Punct_de_vedere_B523-2026.docx
+++ b/public/docs/Punct_de_vedere_B523-2026.docx
@@ -80,7 +80,7 @@
           <w:sz w:val="24"/>
           <w:szCs w:val="24"/>
         </w:rPr>
-        <w:t xml:space="preserve">I. Sinteză Executivă (Scor Risc AI — Gemini + Claude + ChatGPT: 1.2/10)</w:t>
+        <w:t xml:space="preserve">I. Sinteză Executivă</w:t>
       </w:r>
     </w:p>
     <w:p>
@@ -279,7 +279,7 @@
           <w:sz w:val="18"/>
           <w:szCs w:val="18"/>
         </w:rPr>
-        <w:t xml:space="preserve">Generat prin platforma civică destrajă.ro • Referință proiect: B523/2026 (Cod Senat 27962)</w:t>
+        <w:t xml:space="preserve">Pregătit cu destrajă.ro, pe baza analizei a trei modele AI • Referință proiect: B523/2026 (Cod Senat 27962)</w:t>
       </w:r>
     </w:p>
     <w:sectPr>

</xml_diff>